<commit_message>
Add repository link to report
</commit_message>
<xml_diff>
--- a/report.docx
+++ b/report.docx
@@ -112,7 +112,7 @@
           <w:color w:val="352D25"/>
           <w:sz w:val="21"/>
         </w:rPr>
-        <w:t>Media conversion has several steps: read the source format, choose a codec, adjust sample data, and combine stereo channels. MediaConversionFacade exposes one convert(fileName, targetFormat) method and runs these steps in order.</w:t>
+        <w:t>Media conversion has several steps: read the source format, choose a codec, adjust sample data, and combine stereo channels. MediaConversionFacade exposes one convert(fileName, targetFormat) method and runs these steps in order. Without a Facade, the client would need to coordinate each step and know the conversion order.</w:t>
       </w:r>
     </w:p>
     <w:p>
@@ -256,6 +256,7 @@
           <w:color w:val="463728"/>
           <w:sz w:val="28"/>
         </w:rPr>
+        <w:lastRenderedPageBreak/>
         <w:t>3. Clean Code Principles</w:t>
       </w:r>
     </w:p>
@@ -676,6 +677,45 @@
           <w:sz w:val="21"/>
         </w:rPr>
       </w:pPr>
+    </w:p>
+    <w:p>
+      <w:pPr>
+        <w:spacing w:after="60" w:line="240" w:lineRule="auto"/>
+        <w:rPr>
+          <w:rFonts w:ascii="Arial" w:hAnsi="Arial" w:cs="Arial"/>
+          <w:color w:val="352D25"/>
+          <w:sz w:val="21"/>
+        </w:rPr>
+      </w:pPr>
+      <w:r>
+        <w:rPr>
+          <w:rFonts w:ascii="Arial" w:hAnsi="Arial" w:cs="Arial"/>
+          <w:b/>
+          <w:color w:val="352D25"/>
+          <w:sz w:val="28"/>
+        </w:rPr>
+        <w:t>5. GitHub Repository</w:t>
+      </w:r>
+    </w:p>
+    <w:p>
+      <w:pPr>
+        <w:spacing w:after="60" w:line="240" w:lineRule="auto"/>
+        <w:rPr>
+          <w:rFonts w:ascii="Arial" w:hAnsi="Arial" w:cs="Arial"/>
+          <w:color w:val="352D25"/>
+          <w:sz w:val="21"/>
+        </w:rPr>
+      </w:pPr>
+      <w:hyperlink r:id="rId6" w:history="1">
+        <w:r>
+          <w:rPr>
+            <w:rStyle w:val="Hyperlink"/>
+            <w:rFonts w:ascii="Arial" w:hAnsi="Arial" w:cs="Arial"/>
+            <w:sz w:val="21"/>
+          </w:rPr>
+          <w:t>https://github.com/arnur-kozhabergen/sdp.asmnt4</w:t>
+        </w:r>
+      </w:hyperlink>
     </w:p>
     <w:sectPr>
       <w:pgSz w:w="12240" w:h="15840"/>
@@ -1604,6 +1644,29 @@
       <w:spacing w:val="5"/>
     </w:rPr>
   </w:style>
+  <w:style w:type="character" w:styleId="Hyperlink">
+    <w:name w:val="Hyperlink"/>
+    <w:basedOn w:val="DefaultParagraphFont"/>
+    <w:uiPriority w:val="99"/>
+    <w:unhideWhenUsed/>
+    <w:rsid w:val="00000827"/>
+    <w:rPr>
+      <w:color w:val="467886" w:themeColor="hyperlink"/>
+      <w:u w:val="single"/>
+    </w:rPr>
+  </w:style>
+  <w:style w:type="character" w:styleId="UnresolvedMention">
+    <w:name w:val="Unresolved Mention"/>
+    <w:basedOn w:val="DefaultParagraphFont"/>
+    <w:uiPriority w:val="99"/>
+    <w:semiHidden/>
+    <w:unhideWhenUsed/>
+    <w:rsid w:val="00000827"/>
+    <w:rPr>
+      <w:color w:val="605E5C"/>
+      <w:shd w:val="clear" w:color="auto" w:fill="E1DFDD"/>
+    </w:rPr>
+  </w:style>
 </w:styles>
 </file>
 

</xml_diff>